<commit_message>
Completed project 1, added general comparator
</commit_message>
<xml_diff>
--- a/Data/MosAns/ch01/Project 01 - Cabins.docx
+++ b/Data/MosAns/ch01/Project 01 - Cabins.docx
@@ -136,7 +136,7 @@
               </wp:anchor>
             </w:drawing>
           </mc:Choice>
-          <mc:Fallback xmlns:w16cid="http://schemas.microsoft.com/office/word/2016/wordml/cid" xmlns:am3d="http://schemas.microsoft.com/office/drawing/2017/model3d" xmlns:aink="http://schemas.microsoft.com/office/drawing/2016/ink" xmlns:cx8="http://schemas.microsoft.com/office/drawing/2016/5/14/chartex" xmlns:cx7="http://schemas.microsoft.com/office/drawing/2016/5/13/chartex" xmlns:cx6="http://schemas.microsoft.com/office/drawing/2016/5/12/chartex" xmlns:cx5="http://schemas.microsoft.com/office/drawing/2016/5/11/chartex" xmlns:cx4="http://schemas.microsoft.com/office/drawing/2016/5/10/chartex" xmlns:cx3="http://schemas.microsoft.com/office/drawing/2016/5/9/chartex" xmlns:cx2="http://schemas.microsoft.com/office/drawing/2015/10/21/chartex" xmlns:cx1="http://schemas.microsoft.com/office/drawing/2015/9/8/chartex">
+          <mc:Fallback xmlns:cx1="http://schemas.microsoft.com/office/drawing/2015/9/8/chartex" xmlns:cx2="http://schemas.microsoft.com/office/drawing/2015/10/21/chartex" xmlns:cx3="http://schemas.microsoft.com/office/drawing/2016/5/9/chartex" xmlns:cx4="http://schemas.microsoft.com/office/drawing/2016/5/10/chartex" xmlns:cx5="http://schemas.microsoft.com/office/drawing/2016/5/11/chartex" xmlns:cx6="http://schemas.microsoft.com/office/drawing/2016/5/12/chartex" xmlns:cx7="http://schemas.microsoft.com/office/drawing/2016/5/13/chartex" xmlns:cx8="http://schemas.microsoft.com/office/drawing/2016/5/14/chartex" xmlns:aink="http://schemas.microsoft.com/office/drawing/2016/ink" xmlns:am3d="http://schemas.microsoft.com/office/drawing/2017/model3d" xmlns:w16cid="http://schemas.microsoft.com/office/word/2016/wordml/cid">
             <w:pict>
               <v:group w14:anchorId="4E5E35A1" id="Group 7" o:spid="_x0000_s1026" style="position:absolute;margin-left:-36pt;margin-top:-36pt;width:640.5pt;height:167.75pt;z-index:251656192" coordsize="81343,21304" o:gfxdata="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">
                 <v:rect id="Rectangle 3" o:spid="_x0000_s1027" style="position:absolute;width:81343;height:21145;visibility:visible;mso-wrap-style:square;v-text-anchor:middle" o:gfxdata="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" fillcolor="#83d3ff" strokecolor="#0a5382 [1604]" strokeweight="1.25pt">
@@ -443,9 +443,11 @@
           </mc:Fallback>
         </mc:AlternateContent>
       </w:r>
+      <w:proofErr w:type="spellStart"/>
       <w:r>
         <w:t>Hous</w:t>
       </w:r>
+      <w:proofErr w:type="spellEnd"/>
     </w:p>
     <w:p>
       <w:pPr>
@@ -532,6 +534,7 @@
         </w:rPr>
         <w:t xml:space="preserve">You bring your own powerboat, </w:t>
       </w:r>
+      <w:proofErr w:type="spellStart"/>
       <w:r>
         <w:rPr>
           <w:rFonts w:cs="Arial"/>
@@ -560,6 +563,7 @@
         </w:rPr>
         <w:t>unners</w:t>
       </w:r>
+      <w:proofErr w:type="spellEnd"/>
       <w:r>
         <w:rPr>
           <w:rFonts w:cs="Arial"/>
@@ -1206,16 +1210,7 @@
           <w:rFonts w:cs="Arial"/>
           <w:szCs w:val="24"/>
         </w:rPr>
-        <w:t xml:space="preserve"> &amp; cooking utensil</w:t>
-      </w:r>
-      <w:bookmarkStart w:id="0" w:name="_GoBack"/>
-      <w:bookmarkEnd w:id="0"/>
-      <w:r>
-        <w:rPr>
-          <w:rFonts w:cs="Arial"/>
-          <w:szCs w:val="24"/>
-        </w:rPr>
-        <w:t>s</w:t>
+        <w:t xml:space="preserve"> &amp; cooking utensils</w:t>
       </w:r>
     </w:p>
     <w:p>
@@ -1880,12 +1875,21 @@
         </w:rPr>
         <w:t xml:space="preserve">Outdoor </w:t>
       </w:r>
-      <w:r>
-        <w:rPr>
-          <w:rFonts w:cs="Arial"/>
-          <w:szCs w:val="24"/>
-        </w:rPr>
-        <w:t xml:space="preserve">firepit </w:t>
+      <w:proofErr w:type="spellStart"/>
+      <w:r>
+        <w:rPr>
+          <w:rFonts w:cs="Arial"/>
+          <w:szCs w:val="24"/>
+        </w:rPr>
+        <w:t>firepit</w:t>
+      </w:r>
+      <w:proofErr w:type="spellEnd"/>
+      <w:r>
+        <w:rPr>
+          <w:rFonts w:cs="Arial"/>
+          <w:szCs w:val="24"/>
+        </w:rPr>
+        <w:t xml:space="preserve"> </w:t>
       </w:r>
       <w:r>
         <w:rPr>
@@ -2029,8 +2033,17 @@
           <w:rFonts w:cs="Arial"/>
           <w:szCs w:val="24"/>
         </w:rPr>
-        <w:t>Wooden picnic table</w:t>
-      </w:r>
+        <w:t xml:space="preserve">Wooden picnic </w:t>
+      </w:r>
+      <w:proofErr w:type="spellStart"/>
+      <w:r>
+        <w:rPr>
+          <w:rFonts w:cs="Arial"/>
+          <w:szCs w:val="24"/>
+        </w:rPr>
+        <w:t>tabl</w:t>
+      </w:r>
+      <w:proofErr w:type="spellEnd"/>
     </w:p>
     <w:p>
       <w:pPr>
@@ -2041,6 +2054,7 @@
             <w:numFmt w:val="chicago"/>
             <w:numStart w:val="2"/>
           </w:footnotePr>
+          <w:type w:val="continuous"/>
           <w:pgSz w:w="12240" w:h="15840"/>
           <w:pgMar w:top="720" w:right="720" w:bottom="720" w:left="720" w:header="720" w:footer="720" w:gutter="0"/>
           <w:cols w:space="1008"/>
@@ -2053,6 +2067,8 @@
         <w:pStyle w:val="Heading1"/>
         <w:spacing w:before="0"/>
       </w:pPr>
+      <w:bookmarkStart w:id="0" w:name="_GoBack"/>
+      <w:bookmarkEnd w:id="0"/>
       <w:r>
         <w:lastRenderedPageBreak/>
         <w:t>Affordable Pricing</w:t>
@@ -2997,98 +3013,98 @@
         <v:path o:extrusionok="f" gradientshapeok="t" o:connecttype="rect"/>
         <o:lock v:ext="edit" aspectratio="t"/>
       </v:shapetype>
-      <v:shape id="_x0000_i1166" type="#_x0000_t75" style="width:465.85pt;height:465.85pt" o:bullet="t">
+      <v:shape id="_x0000_i1054" type="#_x0000_t75" style="width:465.85pt;height:465.85pt" o:bullet="t">
         <v:imagedata r:id="rId1" o:title=""/>
       </v:shape>
     </w:pict>
   </w:numPicBullet>
   <w:numPicBullet w:numPicBulletId="1">
     <w:pict>
-      <v:shape id="_x0000_i1167" type="#_x0000_t75" style="width:36.75pt;height:36.75pt" o:bullet="t">
+      <v:shape id="_x0000_i1055" type="#_x0000_t75" style="width:36.75pt;height:36.75pt" o:bullet="t">
         <v:imagedata r:id="rId2" o:title=""/>
       </v:shape>
     </w:pict>
   </w:numPicBullet>
   <w:numPicBullet w:numPicBulletId="2">
     <w:pict>
-      <v:shape id="_x0000_i1168" type="#_x0000_t75" style="width:320.25pt;height:390pt" o:bullet="t">
+      <v:shape id="_x0000_i1056" type="#_x0000_t75" style="width:320.25pt;height:390pt" o:bullet="t">
         <v:imagedata r:id="rId3" o:title=""/>
       </v:shape>
     </w:pict>
   </w:numPicBullet>
   <w:numPicBullet w:numPicBulletId="3">
     <w:pict>
-      <v:shape id="_x0000_i1169" type="#_x0000_t75" style="width:384.75pt;height:384.75pt" o:bullet="t">
+      <v:shape id="_x0000_i1057" type="#_x0000_t75" style="width:384.75pt;height:384.75pt" o:bullet="t">
         <v:imagedata r:id="rId4" o:title=""/>
       </v:shape>
     </w:pict>
   </w:numPicBullet>
   <w:numPicBullet w:numPicBulletId="4">
     <w:pict>
-      <v:shape id="_x0000_i1170" type="#_x0000_t75" style="width:108.75pt;height:108.75pt" o:bullet="t">
+      <v:shape id="_x0000_i1058" type="#_x0000_t75" style="width:108.75pt;height:108.75pt" o:bullet="t">
         <v:imagedata r:id="rId5" o:title=""/>
       </v:shape>
     </w:pict>
   </w:numPicBullet>
   <w:numPicBullet w:numPicBulletId="5">
     <w:pict>
-      <v:shape id="_x0000_i1171" type="#_x0000_t75" style="width:142.5pt;height:135.75pt" o:bullet="t">
+      <v:shape id="_x0000_i1059" type="#_x0000_t75" style="width:142.5pt;height:135.75pt" o:bullet="t">
         <v:imagedata r:id="rId6" o:title=""/>
       </v:shape>
     </w:pict>
   </w:numPicBullet>
   <w:numPicBullet w:numPicBulletId="6">
     <w:pict>
-      <v:shape id="_x0000_i1172" type="#_x0000_t75" style="width:226.55pt;height:223.55pt" o:bullet="t">
+      <v:shape id="_x0000_i1060" type="#_x0000_t75" style="width:226.55pt;height:223.55pt" o:bullet="t">
         <v:imagedata r:id="rId7" o:title=""/>
       </v:shape>
     </w:pict>
   </w:numPicBullet>
   <w:numPicBullet w:numPicBulletId="7">
     <w:pict>
-      <v:shape id="_x0000_i1173" type="#_x0000_t75" style="width:71.25pt;height:71.25pt" o:bullet="t">
+      <v:shape id="_x0000_i1061" type="#_x0000_t75" style="width:71.25pt;height:71.25pt" o:bullet="t">
         <v:imagedata r:id="rId8" o:title=""/>
       </v:shape>
     </w:pict>
   </w:numPicBullet>
   <w:numPicBullet w:numPicBulletId="8">
     <w:pict>
-      <v:shape id="_x0000_i1174" type="#_x0000_t75" style="width:138.05pt;height:2in" o:bullet="t">
+      <v:shape id="_x0000_i1062" type="#_x0000_t75" style="width:138.05pt;height:2in" o:bullet="t">
         <v:imagedata r:id="rId9" o:title=""/>
       </v:shape>
     </w:pict>
   </w:numPicBullet>
   <w:numPicBullet w:numPicBulletId="9">
     <w:pict>
-      <v:shape id="_x0000_i1175" type="#_x0000_t75" style="width:144.75pt;height:87.75pt" o:bullet="t">
+      <v:shape id="_x0000_i1063" type="#_x0000_t75" style="width:144.75pt;height:87.75pt" o:bullet="t">
         <v:imagedata r:id="rId10" o:title=""/>
       </v:shape>
     </w:pict>
   </w:numPicBullet>
   <w:numPicBullet w:numPicBulletId="10">
     <w:pict>
-      <v:shape id="_x0000_i1176" type="#_x0000_t75" style="width:135.75pt;height:135.75pt" o:bullet="t">
+      <v:shape id="_x0000_i1064" type="#_x0000_t75" style="width:135.75pt;height:135.75pt" o:bullet="t">
         <v:imagedata r:id="rId11" o:title=""/>
       </v:shape>
     </w:pict>
   </w:numPicBullet>
   <w:numPicBullet w:numPicBulletId="11">
     <w:pict>
-      <v:shape id="_x0000_i1177" type="#_x0000_t75" style="width:2in;height:2in" o:bullet="t">
+      <v:shape id="_x0000_i1065" type="#_x0000_t75" style="width:2in;height:2in" o:bullet="t">
         <v:imagedata r:id="rId12" o:title=""/>
       </v:shape>
     </w:pict>
   </w:numPicBullet>
   <w:numPicBullet w:numPicBulletId="12">
     <w:pict>
-      <v:shape id="_x0000_i1178" type="#_x0000_t75" style="width:305.95pt;height:305.95pt" o:bullet="t">
+      <v:shape id="_x0000_i1066" type="#_x0000_t75" style="width:305.95pt;height:305.95pt" o:bullet="t">
         <v:imagedata r:id="rId13" o:title=""/>
       </v:shape>
     </w:pict>
   </w:numPicBullet>
   <w:numPicBullet w:numPicBulletId="13">
     <w:pict>
-      <v:shape id="_x0000_i1179" type="#_x0000_t75" style="width:391.5pt;height:480pt" o:bullet="t">
+      <v:shape id="_x0000_i1067" type="#_x0000_t75" style="width:391.5pt;height:480pt" o:bullet="t">
         <v:imagedata r:id="rId14" o:title="Trees"/>
       </v:shape>
     </w:pict>
@@ -8878,7 +8894,7 @@
 </file>
 
 <file path=customXml/itemProps1.xml><?xml version="1.0" encoding="utf-8"?>
-<ds:datastoreItem xmlns:ds="http://schemas.openxmlformats.org/officeDocument/2006/customXml" ds:itemID="{80C9756E-505A-4AF5-A1E5-2D40345938B3}">
+<ds:datastoreItem xmlns:ds="http://schemas.openxmlformats.org/officeDocument/2006/customXml" ds:itemID="{78A2E6EB-7BCC-450A-B07F-77EE043955CB}">
   <ds:schemaRefs>
     <ds:schemaRef ds:uri="http://schemas.openxmlformats.org/officeDocument/2006/bibliography"/>
   </ds:schemaRefs>

</xml_diff>